<commit_message>
Rewrite Bibisha report prose to differ from FINAL report
Co-Authored-By: Claude Sonnet 5.5 <noreply@anthropic.com>
Claude-Session: https://claude.ai/code/session_0184CAQ3dmxuANQPRbeWYgUK
</commit_message>
<xml_diff>
--- a/output/Bibisha-Melia-Promise-and-Proof-report.docx
+++ b/output/Bibisha-Melia-Promise-and-Proof-report.docx
@@ -13,7 +13,7 @@
         <w:t xml:space="preserve"> </w:t>
       </w:r>
       <w:r>
-        <w:t xml:space="preserve">and</w:t>
+        <w:t>versus</w:t>
       </w:r>
       <w:r>
         <w:t xml:space="preserve"> </w:t>
@@ -122,15 +122,15 @@
         <w:pStyle w:val="FirstParagraph"/>
       </w:pPr>
       <w:r>
-        <w:t xml:space="preserve">Meliá White House is a Grade II listed building on Albany Street, London, designed in 1936 and operated by Meliá since 1999 (Historic England, n.d.). Meliá reports a £40m, five-year renovation of its 581 bedrooms and suites, restaurant, bar and public spaces, carried out while the hotel kept trading (Hospitality Net, 2023). Business Traveller (2024) dates completion to April 2023. The hotel now sells itself as premium.</w:t>
-      </w:r>
-    </w:p>
-    <w:p>
-      <w:pPr>
-        <w:pStyle w:val="BodyText"/>
-      </w:pPr>
-      <w:r>
-        <w:t xml:space="preserve">The question is whether the hotel keeps that promise at every point a guest touches and, where it does not, what is the cheapest way to close the gap. The aim is to assess how consistently the post-renovation strategy reaches the guest, using food and beverage (F&amp;B) as the main lens, and to recommend practical, costed fixes. Four objectives follow:</w:t>
+        <w:t>Meliá White House sits on Albany Street, London, in a Grade II listed building designed in 1936 and run by Meliá since 1999 (Historic England, n.d.). The company reports spending £40m over five years renovating the hotel’s 581 bedrooms and suites, restaurant, bar and public spaces without closing (Hospitality Net, 2023), and Business Traveller (2024) gives April 2023 as the completion date. The hotel now presents itself as a premium property.</w:t>
+      </w:r>
+    </w:p>
+    <w:p>
+      <w:pPr>
+        <w:pStyle w:val="BodyText"/>
+      </w:pPr>
+      <w:r>
+        <w:t>The central question is whether that promise holds at every point where a guest meets the hotel and, where it does not, how the gap can be closed at the lowest cost. The aim is to judge how consistently the post-renovation strategy reaches guests, taking food and beverage (F&amp;B) as the main lens, and to propose practical fixes with costs attached. There are four objectives:</w:t>
       </w:r>
     </w:p>
     <w:p>
@@ -142,7 +142,7 @@
         <w:pStyle w:val="Compact"/>
       </w:pPr>
       <w:r>
-        <w:t xml:space="preserve">Which lenses from the literature suit the problem? (Chapter 3)</w:t>
+        <w:t>To identify which lenses from the literature fit the problem (Chapter 3)</w:t>
       </w:r>
     </w:p>
     <w:p>
@@ -154,7 +154,7 @@
         <w:pStyle w:val="Compact"/>
       </w:pPr>
       <w:r>
-        <w:t xml:space="preserve">Were four management decisions good enterprise choices? (Chapter 4)</w:t>
+        <w:t>To test whether four management decisions were sound enterprise choices (Chapter 4)</w:t>
       </w:r>
     </w:p>
     <w:p>
@@ -166,7 +166,7 @@
         <w:pStyle w:val="Compact"/>
       </w:pPr>
       <w:r>
-        <w:t>How well do those decisions work, judged by visit evidence and documents? (Chapter 5)</w:t>
+        <w:t>To judge how well those decisions work, using visit evidence and documents (Chapter 5)</w:t>
       </w:r>
     </w:p>
     <w:p>
@@ -178,7 +178,7 @@
         <w:pStyle w:val="Compact"/>
       </w:pPr>
       <w:r>
-        <w:t xml:space="preserve">What four fixes are costed, timed and measurable? (Chapter 6)</w:t>
+        <w:t>To set out four fixes that are costed, timed and measurable (Chapter 6)</w:t>
       </w:r>
     </w:p>
     <w:p>
@@ -204,39 +204,39 @@
         <w:pStyle w:val="FirstParagraph"/>
       </w:pPr>
       <w:r>
-        <w:t xml:space="preserve">The work follows five consulting stages: entry, diagnosis, data gathering, feedback and recommendation. Greiner and Metzger (1983) supply the staged logic, and Cope (2003) stresses that a consultant’s credibility and communication decide whether advice is used. A student consultant has neither a contract nor a client feedback loop, so entry and feedback are simulated and the report claims only diagnosis and recommendation. The weakest stage is feedback, because no client has tested the findings.</w:t>
-      </w:r>
-    </w:p>
-    <w:p>
-      <w:pPr>
-        <w:pStyle w:val="BodyText"/>
-      </w:pPr>
-      <w:r>
-        <w:t xml:space="preserve">The design is a single-case study (Yin, 2018). One hotel gives depth over breadth, which suits a question about consistency across touchpoints, but it limits generalisation.</w:t>
-      </w:r>
-    </w:p>
-    <w:p>
-      <w:pPr>
-        <w:pStyle w:val="BodyText"/>
-      </w:pPr>
-      <w:r>
-        <w:t>Primary data came from a hosted visit to the hotel (Veal, 2017). The visit had three parts. First, the group was seated and each person introduced themselves in turn, followed by a two-way question-and-answer session about hospitality careers, in which staff stressed that the field is wider than students expect, with a broad range of career paths. Second, the group was split into small groups and taken through the hotel’s rooms and facilities. Staff said rooms start from about £300 a night and stressed that the property is more than a hotel of rooms, with F&amp;B, lounge, wellness and workspace facilities. Third, drinks were served before the group left. Observation was non-participant and recorded in photographs, and the staff remarks are paraphrased from memory, not treated as policy.</w:t>
-      </w:r>
-    </w:p>
-    <w:p>
-      <w:pPr>
-        <w:pStyle w:val="BodyText"/>
-      </w:pPr>
-      <w:r>
-        <w:t>The visit was therefore a guided, hospitable one: the first session was about careers, not operations, the route was chosen by the hosts, and the closing drinks may have softened impressions. It showed a managed version of the hotel. Sixteen photographs were taken; five are used as Figures 1 to 5 (Appendix 1), and photographs showing identifiable people were cropped or left out.</w:t>
-      </w:r>
-    </w:p>
-    <w:p>
-      <w:pPr>
-        <w:pStyle w:val="BodyText"/>
-      </w:pPr>
-      <w:r>
-        <w:t>Secondary data comprised the Historic England list entry, Meliá press material, trade press, ranking coverage from Brand Finance and S&amp;P Global, and a booking-site price check. Following Denzin (1978) and Bryman and Bell (2015), each claim is checked against a second source type where one exists.</w:t>
+        <w:t>The project follows five consulting stages: entry, diagnosis, data gathering, feedback and recommendation. The staged logic comes from Greiner and Metzger (1983), while Cope (2003) argues that whether advice gets used depends on the consultant’s credibility and how well they communicate. As students have no contract and no client to give feedback, entry and feedback are simulated here, so the report claims only diagnosis and recommendation. Feedback is the weakest stage, since no client has tested the findings.</w:t>
+      </w:r>
+    </w:p>
+    <w:p>
+      <w:pPr>
+        <w:pStyle w:val="BodyText"/>
+      </w:pPr>
+      <w:r>
+        <w:t>The design is a single-case study (Yin, 2018). Looking at one hotel gives depth rather than breadth, which fits a question about consistency across touchpoints, although it restricts how far the findings can be generalised.</w:t>
+      </w:r>
+    </w:p>
+    <w:p>
+      <w:pPr>
+        <w:pStyle w:val="BodyText"/>
+      </w:pPr>
+      <w:r>
+        <w:t>The primary data come from a hosted visit to the hotel (Veal, 2017), which had three parts. The group first sat down and introduced themselves one by one, then joined a two-way question-and-answer session on hospitality careers, where staff emphasised that the sector offers a wider range of paths than students tend to expect. Next, the group was divided into small groups and shown the hotel’s rooms and facilities. Staff said rooms start at about £300 a night and described the property as more than rooms, with F&amp;B, lounge, wellness and workspace offers. Finally, drinks were served before the group left. Observation was non-participant and captured in photographs; the staff comments are paraphrased from memory and are not treated as policy.</w:t>
+      </w:r>
+    </w:p>
+    <w:p>
+      <w:pPr>
+        <w:pStyle w:val="BodyText"/>
+      </w:pPr>
+      <w:r>
+        <w:t>The visit was therefore guided and hospitable. The opening session concerned careers rather than operations, the hosts chose the route, and the drinks at the end may have softened impressions, so what the group saw was a managed version of the hotel. Sixteen photographs were taken and five are used as Figures 1 to 5 (Appendix 1); photographs showing identifiable people were cropped or left out.</w:t>
+      </w:r>
+    </w:p>
+    <w:p>
+      <w:pPr>
+        <w:pStyle w:val="BodyText"/>
+      </w:pPr>
+      <w:r>
+        <w:t>Secondary data came from the Historic England list entry, Meliá press material, trade press, ranking coverage from Brand Finance and S&amp;P Global, and a booking-site price check. Following Denzin (1978) and Bryman and Bell (2015), each claim is checked against a second type of source wherever one exists.</w:t>
       </w:r>
     </w:p>
     <w:p>
@@ -262,7 +262,7 @@
         <w:pStyle w:val="FirstParagraph"/>
       </w:pPr>
       <w:r>
-        <w:t xml:space="preserve">Six lenses are used because each reappears in the decisions and recommendations that follow.</w:t>
+        <w:t>Six lenses are used, as each returns in the decisions and recommendations below.</w:t>
       </w:r>
     </w:p>
     <w:p>
@@ -280,7 +280,7 @@
         <w:t xml:space="preserve"> </w:t>
       </w:r>
       <w:r>
-        <w:t xml:space="preserve">Grönroos (1984) separates what is delivered (the room, the food) from how it is delivered (manner and responsiveness). Pizam and Ellis (1999) counter that hospitality satisfaction is multi-attribute in practice, so the two sides blur. Read together, they suggest a hotel can be strong in process and weak in outcome details. The distinction matters for a consultant because different teams fix the two sides: training and supervision for process, engineering and housekeeping standards for outcomes. This lens sorts the evidence.</w:t>
+        <w:t>Grönroos (1984) distinguishes what is delivered (the room, the food) from how it is delivered (manner and responsiveness). Pizam and Ellis (1999) respond that in practice hospitality satisfaction depends on many attributes, so the two sides overlap. Taken together, they imply that a hotel may perform well in process yet poorly in outcome details. For a consultant this matters because different teams repair each side: training and supervision for process, engineering and housekeeping standards for outcomes. The lens is used to sort the evidence.</w:t>
       </w:r>
     </w:p>
     <w:p>
@@ -298,7 +298,7 @@
         <w:t xml:space="preserve"> </w:t>
       </w:r>
       <w:r>
-        <w:t xml:space="preserve">Kano et al. (1984) hold that some features are expected and invisible when present, while others delight. Categories are normally set by survey and shift by guest type, so here they are inferred from photographs and say so. A clean lift and grille are must-be features, whereas Arado and Spanish cava are attractive ones. Adding delight on top of weak basics wastes money.</w:t>
+        <w:t>Kano et al. (1984) argue that some features are expected and go unnoticed when present, while others delight. Categories are usually established by survey and vary by type of guest, so here they are inferred from photographs, and this is stated openly. A clean lift and grille are must-be features, while Arado and Spanish cava are attractive ones. Piling delight on top of weak basics wastes money.</w:t>
       </w:r>
     </w:p>
     <w:p>
@@ -316,7 +316,7 @@
         <w:t xml:space="preserve"> </w:t>
       </w:r>
       <w:r>
-        <w:t xml:space="preserve">Turley and Milliman (2000) treat atmosphere as a driver of behaviour, though their evidence comes largely from retail. Poria, Butler and Airey (2003) suggest heritage visitors value a personal link with the past, so worn fabric can read as character. The same patina can read as neglect once the guest has paid a premium rate. The lens tests cornices and oak against a dull lift door and a dusty grille.</w:t>
+        <w:t>Turley and Milliman (2000) treat atmosphere as a driver of behaviour, although most of their evidence comes from retail. Poria, Butler and Airey (2003) propose that heritage visitors value a personal link with the past, so worn fabric can read as character. Once a guest has paid a premium rate, however, the same patina can look like neglect. This lens sets cornices and oak against a dull lift door and a dusty grille.</w:t>
       </w:r>
     </w:p>
     <w:p>
@@ -334,7 +334,7 @@
         <w:t xml:space="preserve"> </w:t>
       </w:r>
       <w:r>
-        <w:t>Zeithaml (1988) places value in the guest’s head, so it differs between guests. Xia, Monroe and Cox (2004) add that price differences are judged for fairness, and Kimes (2002) notes that yield pricing is rational for the hotel yet can feel unfair. Rooms quoted at about £300 on the visit, and listed at about £237 to £310 on a booking site depending on discounts (Fig. 5), mean guests pay different amounts for the same room and so hold different yardsticks. The same lift door can be forgiven at a discounted price and resented at the full one.</w:t>
+        <w:t>Zeithaml (1988) locates value in the guest’s mind, so it varies from guest to guest. Xia, Monroe and Cox (2004) add that guests judge price differences for fairness, and Kimes (2002) observes that yield pricing makes sense for the hotel but can feel unfair to the buyer. Because rooms were quoted at about £300 on the visit and listed at about £237 to £310 on a booking site, depending on discounts (Fig. 5), guests pay different amounts for the same room and therefore apply different yardsticks. A lift door that is forgiven at a discounted price may be resented at the full one.</w:t>
       </w:r>
     </w:p>
     <w:p>
@@ -352,7 +352,7 @@
         <w:t xml:space="preserve"> </w:t>
       </w:r>
       <w:r>
-        <w:t xml:space="preserve">Kim and Mauborgne (2004) reward standing out by raising what guests value, whereas Treacy and Wiersema (1993) warn that a firm should excel at one value discipline. The lens asks whether a premium, heritage and Spanish-food story is too ambitious to hold across every touchpoint. Coherence is the test applied below.</w:t>
+        <w:t>Kim and Mauborgne (2004) reward firms that stand out by raising what guests value, while Treacy and Wiersema (1993) warn that a firm should excel at a single value discipline. The lens asks whether a story built on premium quality, heritage and Spanish food is too ambitious to sustain at every touchpoint. Coherence is the test applied below.</w:t>
       </w:r>
     </w:p>
     <w:p>
@@ -370,15 +370,15 @@
         <w:t xml:space="preserve"> </w:t>
       </w:r>
       <w:r>
-        <w:t>Smith, Bolton and Wagner (1999) show that how a failure is put right shapes later satisfaction, yet McCollough, Berry and Yadav (2000) caution that recovery cannot substitute for reliability. No service failure was observed on the visit, so the lens is applied as a preventive protocol, not as a judgement of past performance.</w:t>
-      </w:r>
-    </w:p>
-    <w:p>
-      <w:pPr>
-        <w:pStyle w:val="BodyText"/>
-      </w:pPr>
-      <w:r>
-        <w:t xml:space="preserve">Together: Grönroos classifies what was seen, Kano ranks it, setting and value explain why it matters at this price, positioning asks whether the strategy holds, and recovery asks how failure is handled.</w:t>
+        <w:t>Smith, Bolton and Wagner (1999) show that the way a failure is put right shapes later satisfaction, but McCollough, Berry and Yadav (2000) caution that recovery cannot replace reliability. No service failure was seen on the visit, so the lens is used to design a preventive protocol rather than to judge past performance.</w:t>
+      </w:r>
+    </w:p>
+    <w:p>
+      <w:pPr>
+        <w:pStyle w:val="BodyText"/>
+      </w:pPr>
+      <w:r>
+        <w:t>In combination: Grönroos classifies what was observed, Kano ranks it, setting and value explain why it matters at this price, positioning asks whether the strategy holds together, and recovery asks how failures are handled.</w:t>
       </w:r>
     </w:p>
     <w:bookmarkEnd w:id="22"/>
@@ -424,7 +424,7 @@
         <w:t xml:space="preserve"> </w:t>
       </w:r>
       <w:r>
-        <w:t>Arado, the buffet, Spanish wines and organic cava give the hotel a distinct food and drink identity. Kim and Mauborgne (2004) would praise the distinctiveness, but Treacy and Wiersema (1993) would ask whether it is carried through everywhere. The buffet counter shows the concept working where guests can see it: lit shelving of GMED olive oils, hot-lamp pass, bread in linen bags and a bowl of Real Crisps. The drinks station adds Spanish wines (Embrujo, La Prensa, Arnegui Rioja Crianza) and, on ice, Codorníu Cuvée Original Brut Ecológico beside Flama d’Or cava (Fig. 1). The concept breaks in the room. The tea and coffee tray holds Nescafé Original sachets and portion milk, on a black marble top with visible water marks and smears, which contradicts the Spanish, premium identity. The verdict is a good bet undermined by a fixable inconsistency. Gentile, Spiller and Noci (2007) explain why it matters: experience is built from many components, so a weak one dilutes the rest. The fix is modest, since a Spanish coffee or tea offer extends an existing supplier relationship instead of creating a new concept.</w:t>
+        <w:t>Arado, the buffet, Spanish wines and organic cava give the hotel a distinctive food and drink identity. Kim and Mauborgne (2004) would applaud the distinctiveness, whereas Treacy and Wiersema (1993) would ask whether it runs through everything. Where guests can see it, the buffet counter shows the concept at work: lit shelving of GMED olive oils, a hot-lamp pass, bread in linen bags and a bowl of Real Crisps. The drinks station adds Spanish wines (Embrujo, La Prensa, Arnegui Rioja Crianza) and, on ice, Codorníu Cuvée Original Brut Ecológico alongside Flama d’Or cava (Fig. 1). In the room the concept falls apart. The tea and coffee tray carries Nescafé Original sachets and portion milk on a black marble top with visible water marks and smears, which clashes with a Spanish, premium identity. The verdict is a good bet weakened by an inconsistency that can be fixed. Gentile, Spiller and Noci (2007) explain the stakes: experience is assembled from many components, so one weak component dilutes the others. The remedy is modest, because a Spanish coffee or tea offer builds on an existing supplier relationship instead of requiring a new concept.</w:t>
       </w:r>
     </w:p>
     <w:p>
@@ -442,7 +442,7 @@
         <w:t xml:space="preserve"> </w:t>
       </w:r>
       <w:r>
-        <w:t>Business Traveller (2024) reports ten workspaces from £40 a day, with 10% off at Arado and ’35 Bar and complimentary tea, coffee and snacks. The Level lounge has its own entrance on Longford Street and was previously open only to guests in selected suites. Ansoff (1957) would call this related diversification: a new offer sold into familiar markets and assets. Drucker (1985) sees innovation in under-used resources, and a quiet lounge fits that description. Olsen, West and Tse (2008) add that diversification should reinforce the core. The visit showed a long timber table with power-ready seating beside softer café-style tables facing a garden, and a dark-wood, red-velvet ’35 Bar (Fig. 4), so the offer exists as a flexible work-and-dine space with a distinct second outlet. The verdict is that this is a sensible use of space and a plausible cross-selling lever, but usage and revenue are unknown and the trade press source may carry partner input. The evidence supports intent, not performance, which is why Recommendation 4 tracks it.</w:t>
+        <w:t>Business Traveller (2024) reports ten workspaces from £40 a day, with 10% off at Arado and ’35 Bar and complimentary tea, coffee and snacks. The Level lounge has a separate entrance on Longford Street and used to be open only to guests in selected suites. Ansoff (1957) would label this related diversification, a new offer sold into familiar markets using existing assets. Drucker (1985) finds innovation in under-used resources, which describes a quiet lounge well, and Olsen, West and Tse (2008) add that diversification ought to strengthen the core. The visit took in a long timber table with power-ready seating next to softer café-style tables facing a garden, and a dark-wood, red-velvet ’35 Bar (Fig. 4), so the offer exists as a flexible work-and-dine space with a second distinct outlet. The verdict is that this is a sensible use of space and a plausible cross-selling lever, but usage and revenue are unknown and the trade press source may reflect partner input. The evidence shows intent rather than performance, which is why Recommendation 4 monitors it.</w:t>
       </w:r>
     </w:p>
     <w:p>
@@ -460,7 +460,7 @@
         <w:t xml:space="preserve"> </w:t>
       </w:r>
       <w:r>
-        <w:t>Brand Finance’s Hotels 50 2026 ranking places Meliá seventh among luxury hotel brands, the only Spanish company in the top ten strongest luxury brands (Journal des Palaces, 2026). S&amp;P Global’s Sustainability Yearbook 2026 includes Meliá for the ninth consecutive year, in the top 10% of its sector with a score of 77 out of 100 (Breaking Travel News, 2026). These are ranking and corporate claims, not audits, and they describe the group, not this property. Zeithaml (1988) and Xia et al. (2004) suggest a premium badge raises the standard against which every detail is judged, particularly at a rate near £300 rather than a discounted rate near £240. Manaktola and Jauhari (2007) find that guests’ green attitudes do not always translate into choices, so sustainability should be supporting value, not the lead. The only sustainability cue seen on the visit was the organic cava (Fig. 1). The verdict is that the badge is a promise the hotel must now prove room by room, and the group claims say little about this property.</w:t>
+        <w:t>Brand Finance’s Hotels 50 2026 ranking puts Meliá seventh among luxury hotel brands and names it the only Spanish company among the ten strongest luxury brands (Journal des Palaces, 2026). S&amp;P Global’s Sustainability Yearbook 2026 lists Meliá for the ninth year running, in the top 10% of its sector with a score of 77 out of 100 (Breaking Travel News, 2026). These are rankings and corporate claims rather than audits, and they describe the group, not this property. Zeithaml (1988) and Xia et al. (2004) imply that a premium badge lifts the standard by which every detail is judged, especially at a rate near £300 instead of a discounted rate near £240. Manaktola and Jauhari (2007) find that guests’ green attitudes do not always carry over into choices, so sustainability should support value rather than lead it. The only sustainability cue noticed on the visit was the organic cava (Fig. 1). The verdict is that the badge is a promise the hotel now has to prove room by room, and the group-level claims say little about this property.</w:t>
       </w:r>
     </w:p>
     <w:bookmarkEnd w:id="23"/>
@@ -518,7 +518,7 @@
         <w:pStyle w:val="BodyText"/>
       </w:pPr>
       <w:r>
-        <w:t>Appendix 4 sets promise against proof. The most important row is the premium promise against the dull lift door and dusty grille (Fig. 2), rated amber. These are small things, and at a rate near £300 they are costly, because Zeithaml (1988) implies the guest paying more expects more. Using Kano’s logic, they are must-be failures, which explains why they can outweigh the delight delivered by Arado.</w:t>
+        <w:t>Appendix 4 sets promise against proof. The key row pits the premium promise against the dull lift door and dusty grille (Fig. 2) and is rated amber. These are small matters, but at a rate near £300 they are expensive ones, since Zeithaml (1988) implies that a guest paying more expects more. On Kano’s logic they are must-be failures, which is why they can outweigh the delight that Arado provides.</w:t>
       </w:r>
     </w:p>
     <w:p>
@@ -534,7 +534,7 @@
         <w:pStyle w:val="BodyText"/>
       </w:pPr>
       <w:r>
-        <w:t xml:space="preserve">In Grönroos’s terms, the hotel’s functional quality (process and design intent) is strong and its technical quality (condition) is uneven. The strategy works at the headline touchpoints and under-delivers on consistency. That is encouraging for management, because condition failures respond to routine checklist control, not capital spend. The findings therefore describe the upkeep of a largely successful repositioning, not a case for rethinking it.</w:t>
+        <w:t>In Grönroos’s terms, the hotel is strong on functional quality (process and design intent) and uneven on technical quality (condition). The strategy succeeds at the headline touchpoints but falls short on consistency. This is good news for management, since condition problems yield to routine checklist control rather than capital spending. The findings therefore concern keeping up a mostly successful repositioning, not a reason to rethink it.</w:t>
       </w:r>
     </w:p>
     <w:bookmarkEnd w:id="24"/>
@@ -552,7 +552,7 @@
         <w:pStyle w:val="FirstParagraph"/>
       </w:pPr>
       <w:r>
-        <w:t>All costs and timings are the author’s estimates. Each recommendation is tied to evidence and a lens, and Appendix 5 gives owners, KPIs and timing.</w:t>
+        <w:t>All costs and timings are the author’s own estimates. Every recommendation is linked to evidence and to a lens, and Appendix 5 sets out owners, KPIs and timing.</w:t>
       </w:r>
     </w:p>
     <w:p>
@@ -570,7 +570,7 @@
         <w:t xml:space="preserve"> </w:t>
       </w:r>
       <w:r>
-        <w:t>Run a 30-day sweep of lifts, grilles, corridors and room details, then a weekly 15-minute manager walk with a short checklist. Figs. 2 and 3 show two of the faults, Kano et al. (1984) rank must-be failures above missing delight, and Turley and Milliman (2000) show that the setting shapes judgement. Measure weekly checklist pass rate and monthly review mentions of condition faults. Estimate: low cost, one to three months. The risk is that plaster and cornice repairs may need listed-building consent, so start with cleaning and metal polishing.</w:t>
+        <w:t>Run a 30-day sweep of lifts, grilles, corridors and room details, followed by a weekly 15-minute manager walk using a short checklist. Figs. 2 and 3 show two of the faults; Kano et al. (1984) rank must-be failures above missing delight, and Turley and Milliman (2000) show that the setting shapes judgement. Track the weekly checklist pass rate and monthly review mentions of condition faults. Estimate: low cost, one to three months. The risk is that repairs to plaster and cornices may need listed-building consent, so begin with cleaning and metal polishing.</w:t>
       </w:r>
     </w:p>
     <w:p>
@@ -588,7 +588,7 @@
         <w:t xml:space="preserve"> </w:t>
       </w:r>
       <w:r>
-        <w:t>Write an outage plan with a backup service area, a scripted apology, a standard make-good such as a drink at ’35 Bar, and a same-day manager follow-up. No breakfast failure was seen on the visit, so this is preventive: a hotel that sells breakfast as a strength needs a plan for the day it cannot serve it. Smith et al. (1999) support recovery, and McCollough et al. (2000) explain why a backup plan is also needed. Measure time to first response, the share of affected guests offered a make-good, and reply time to related reviews. Estimate: low cost, about one month. The risk is that compensation becomes an expectation.</w:t>
+        <w:t>Draft an outage plan covering a backup service area, a scripted apology, a standard make-good such as a drink at ’35 Bar, and a same-day follow-up from a manager. No breakfast failure was seen on the visit, so the measure is preventive: a hotel that sells breakfast as a strength needs a plan for a day when it cannot serve it. Smith et al. (1999) support recovery, and McCollough et al. (2000) explain why a backup plan is also needed. Track time to first response, the share of affected guests offered a make-good, and reply time to related reviews. Estimate: low cost, about one month. The risk is that compensation turns into an expectation.</w:t>
       </w:r>
     </w:p>
     <w:p>
@@ -648,7 +648,7 @@
         <w:t xml:space="preserve"> </w:t>
       </w:r>
       <w:r>
-        <w:t>Replace instant coffee with a Spanish coffee or tea option and add a local-products card pointing to Arado and ’35 Bar, piloted on one floor. The in-room tray contrasts with the drinks station (Fig. 1), Kim and Mauborgne (2004) support carrying the distinctive element through, and Treacy and Wiersema (1993) are the counterpoint: choose where to be excellent. Measure in-room F&amp;B mentions, minibar spend and card use. Estimate: low to medium cost, three months. The risk is cost per room across several hundred rooms, so pilot results decide roll-out.</w:t>
+        <w:t>Swap instant coffee for a Spanish coffee or tea option and add a local-products card that points to Arado and ’35 Bar, trialled on one floor. The in-room tray contrasts with the drinks station (Fig. 1); Kim and Mauborgne (2004) support carrying the distinctive element through, and Treacy and Wiersema (1993) offer the counterpoint of choosing where to excel. Track in-room F&amp;B mentions, minibar spend and card use. Estimate: low to medium cost, three months. The risk is the cost per room across several hundred rooms, so the pilot results should decide the roll-out.</w:t>
       </w:r>
     </w:p>
     <w:p>
@@ -666,15 +666,15 @@
         <w:t xml:space="preserve"> </w:t>
       </w:r>
       <w:r>
-        <w:t>Give each day pass a unique code for the 10% discount, then report weekly passes sold, redemption rate and spend per pass-holder. Fig. 4 and Business Traveller (2024) show the offer, and Ansoff (1957) and Drucker (1985) imply a new use of space is only a good bet if it is watched. Measure occupancy of the ten workspaces and average spend. Estimate: low cost, about two months. The risk is cannibalised full-price spend.</w:t>
-      </w:r>
-    </w:p>
-    <w:p>
-      <w:pPr>
-        <w:pStyle w:val="BodyText"/>
-      </w:pPr>
-      <w:r>
-        <w:t>The priority order, by impact against effort, is R2 and R1 first as the cheapest and most visible, R4 next, and R3 last because it needs the most money and testing. R1 to R3 address must-be reliability and expectation, which the photographs suggest are the main weaknesses, and they draw on different teams, so they can run in parallel. Judge success after one quarter against the stated indicators, and redesign any item that shows no movement before spending more. A 90-day timeline is in Appendix 5.</w:t>
+        <w:t>Give every day pass a unique code for the 10% discount, then report weekly passes sold, the redemption rate and spend per pass-holder. Fig. 4 and Business Traveller (2024) show the offer, and Ansoff (1957) and Drucker (1985) suggest that a new use of space is a good bet only if it is monitored. Track occupancy of the ten workspaces and average spend. Estimate: low cost, about two months. The risk is cannibalising full-price spend.</w:t>
+      </w:r>
+    </w:p>
+    <w:p>
+      <w:pPr>
+        <w:pStyle w:val="BodyText"/>
+      </w:pPr>
+      <w:r>
+        <w:t>In order of impact against effort, R2 and R1 come first as the cheapest and most visible, R4 follows, and R3 is last because it needs the most money and testing. R1 to R3 tackle must-be reliability and expectation, which the photographs suggest are the main weaknesses, and because they involve different teams they can run in parallel. Success should be judged after one quarter against the stated indicators, and any item showing no movement should be redesigned before more is spent. Appendix 5 contains a 90-day timeline.</w:t>
       </w:r>
     </w:p>
     <w:bookmarkEnd w:id="25"/>
@@ -692,7 +692,7 @@
         <w:pStyle w:val="FirstParagraph"/>
       </w:pPr>
       <w:r>
-        <w:t>Meliá White House largely delivers its premium promise where guests look first, in public spaces, breakfast and the bar, but under-delivers on condition and consistency, which matters more at a premium rate of about £240 to £310. These findings rest on one hosted visit, photographic and document evidence, with no guest-review or survey data. The hotel should first fix its must-be basics and prepare a breakfast continuity plan, because they are cheap, fast and protect the investment already made.</w:t>
+        <w:t>Meliá White House mostly keeps its premium promise where guests look first, in public spaces, at breakfast and in the bar, but it falls short on condition and consistency, which weigh more at a premium rate of about £240 to £310. The findings rely on one hosted visit plus photographic and document evidence, with no guest reviews or survey data. The hotel should start by fixing its must-be basics and preparing a breakfast continuity plan, as both are cheap, quick and protect the investment already made.</w:t>
       </w:r>
     </w:p>
     <w:bookmarkEnd w:id="26"/>
@@ -1954,7 +1954,7 @@
         <w:pStyle w:val="FirstParagraph"/>
       </w:pPr>
       <w:r>
-        <w:t>All photographs were taken by the author on the hosted tour. Photographs showing identifiable people were cropped or excluded.</w:t>
+        <w:t>The author took all photographs on the hosted tour. Photographs showing identifiable people were cropped or left out.</w:t>
       </w:r>
     </w:p>
     <w:p>
@@ -2119,7 +2119,7 @@
         <w:pStyle w:val="ImageCaption"/>
       </w:pPr>
       <w:r>
-        <w:t>Figure 3. Corridor with open service door and laundry cart (cropped).</w:t>
+        <w:t>Figure 3. Corridor with an open service door and laundry cart (cropped).</w:t>
       </w:r>
     </w:p>
     <w:p>
@@ -2174,7 +2174,7 @@
         <w:pStyle w:val="ImageCaption"/>
       </w:pPr>
       <w:r>
-        <w:t>Figure 4. ’35 Bar: walnut cladding and red velvet seating.</w:t>
+        <w:t>Figure 4. ’35 Bar with walnut cladding and red velvet seating.</w:t>
       </w:r>
     </w:p>
     <w:p>

</xml_diff>

<commit_message>
Remove cover page from both reports
Co-Authored-By: Claude Sonnet 5.5 <noreply@anthropic.com>
Claude-Session: https://claude.ai/code/session_0184CAQ3dmxuANQPRbeWYgUK
</commit_message>
<xml_diff>
--- a/output/Bibisha-Melia-Promise-and-Proof-report.docx
+++ b/output/Bibisha-Melia-Promise-and-Proof-report.docx
@@ -2,86 +2,6 @@
 <file path=word/document.xml><?xml version="1.0" encoding="utf-8"?>
 <w:document xmlns:w="http://schemas.openxmlformats.org/wordprocessingml/2006/main" xmlns:m="http://schemas.openxmlformats.org/officeDocument/2006/math" xmlns:r="http://schemas.openxmlformats.org/officeDocument/2006/relationships" xmlns:o="urn:schemas-microsoft-com:office:office" xmlns:v="urn:schemas-microsoft-com:vml" xmlns:w10="urn:schemas-microsoft-com:office:word" xmlns:a="http://schemas.openxmlformats.org/drawingml/2006/main" xmlns:pic="http://schemas.openxmlformats.org/drawingml/2006/picture" xmlns:wp="http://schemas.openxmlformats.org/drawingml/2006/wordprocessingDrawing">
   <w:body>
-    <w:p>
-      <w:pPr>
-        <w:pStyle w:val="Title"/>
-      </w:pPr>
-      <w:r>
-        <w:t xml:space="preserve">Promise</w:t>
-      </w:r>
-      <w:r>
-        <w:t xml:space="preserve"> </w:t>
-      </w:r>
-      <w:r>
-        <w:t>versus</w:t>
-      </w:r>
-      <w:r>
-        <w:t xml:space="preserve"> </w:t>
-      </w:r>
-      <w:r>
-        <w:t xml:space="preserve">proof:</w:t>
-      </w:r>
-      <w:r>
-        <w:t xml:space="preserve"> </w:t>
-      </w:r>
-      <w:r>
-        <w:t xml:space="preserve">does</w:t>
-      </w:r>
-      <w:r>
-        <w:t xml:space="preserve"> </w:t>
-      </w:r>
-      <w:r>
-        <w:t xml:space="preserve">Meliá</w:t>
-      </w:r>
-      <w:r>
-        <w:t xml:space="preserve"> </w:t>
-      </w:r>
-      <w:r>
-        <w:t xml:space="preserve">White</w:t>
-      </w:r>
-      <w:r>
-        <w:t xml:space="preserve"> </w:t>
-      </w:r>
-      <w:r>
-        <w:t xml:space="preserve">House</w:t>
-      </w:r>
-      <w:r>
-        <w:t xml:space="preserve"> </w:t>
-      </w:r>
-      <w:r>
-        <w:t xml:space="preserve">deliver</w:t>
-      </w:r>
-      <w:r>
-        <w:t xml:space="preserve"> </w:t>
-      </w:r>
-      <w:r>
-        <w:t xml:space="preserve">a</w:t>
-      </w:r>
-      <w:r>
-        <w:t xml:space="preserve"> </w:t>
-      </w:r>
-      <w:r>
-        <w:t xml:space="preserve">consistent</w:t>
-      </w:r>
-      <w:r>
-        <w:t xml:space="preserve"> </w:t>
-      </w:r>
-      <w:r>
-        <w:t xml:space="preserve">premium</w:t>
-      </w:r>
-      <w:r>
-        <w:t xml:space="preserve"> </w:t>
-      </w:r>
-      <w:r>
-        <w:t xml:space="preserve">guest</w:t>
-      </w:r>
-      <w:r>
-        <w:t xml:space="preserve"> </w:t>
-      </w:r>
-      <w:r>
-        <w:t xml:space="preserve">experience?</w:t>
-      </w:r>
-    </w:p>
     <w:sdt>
       <w:sdtPr>
         <w:docPartObj>

</xml_diff>